<commit_message>
Record chi192 upper-rate feasibility gate
</commit_message>
<xml_diff>
--- a/research/transition-order/branch192-report.docx
+++ b/research/transition-order/branch192-report.docx
@@ -112,7 +112,7 @@
           <w:b/>
           <w:i w:val="0"/>
         </w:rPr>
-        <w:t>3.00 h</w:t>
+        <w:t>3.41 h</w:t>
       </w:r>
       <w:r>
         <w:rPr>
@@ -126,7 +126,7 @@
           <w:b/>
           <w:i w:val="0"/>
         </w:rPr>
-        <w:t>2.00 h</w:t>
+        <w:t>1.59 h</w:t>
       </w:r>
       <w:r>
         <w:rPr>

</xml_diff>

<commit_message>
Record chi192 upper-rate interruption and cap extension
</commit_message>
<xml_diff>
--- a/research/transition-order/branch192-report.docx
+++ b/research/transition-order/branch192-report.docx
@@ -112,7 +112,7 @@
           <w:b/>
           <w:i w:val="0"/>
         </w:rPr>
-        <w:t>3.41 h</w:t>
+        <w:t>12.28 h</w:t>
       </w:r>
       <w:r>
         <w:rPr>
@@ -126,7 +126,7 @@
           <w:b/>
           <w:i w:val="0"/>
         </w:rPr>
-        <w:t>1.59 h</w:t>
+        <w:t>0.00 h</w:t>
       </w:r>
       <w:r>
         <w:rPr>

</xml_diff>